<commit_message>
kubernetes - batch-workloads updated
</commit_message>
<xml_diff>
--- a/Kubernetes/9-batch-workloads.docx
+++ b/Kubernetes/9-batch-workloads.docx
@@ -1,6 +1,6 @@
 
 <file path=word/document.xml><?xml version="1.0" encoding="utf-8"?>
-<w:document xmlns:wpc="http://schemas.microsoft.com/office/word/2010/wordprocessingCanvas" xmlns:cx="http://schemas.microsoft.com/office/drawing/2014/chartex" xmlns:cx1="http://schemas.microsoft.com/office/drawing/2015/9/8/chartex" xmlns:cx2="http://schemas.microsoft.com/office/drawing/2015/10/21/chartex" xmlns:cx3="http://schemas.microsoft.com/office/drawing/2016/5/9/chartex" xmlns:cx4="http://schemas.microsoft.com/office/drawing/2016/5/10/chartex" xmlns:cx5="http://schemas.microsoft.com/office/drawing/2016/5/11/chartex" xmlns:cx6="http://schemas.microsoft.com/office/drawing/2016/5/12/chartex" xmlns:cx7="http://schemas.microsoft.com/office/drawing/2016/5/13/chartex" xmlns:cx8="http://schemas.microsoft.com/office/drawing/2016/5/14/chartex" xmlns:mc="http://schemas.openxmlformats.org/markup-compatibility/2006" xmlns:aink="http://schemas.microsoft.com/office/drawing/2016/ink" xmlns:am3d="http://schemas.microsoft.com/office/drawing/2017/model3d" xmlns:o="urn:schemas-microsoft-com:office:office" xmlns:oel="http://schemas.microsoft.com/office/2019/extlst" xmlns:r="http://schemas.openxmlformats.org/officeDocument/2006/relationships" xmlns:m="http://schemas.openxmlformats.org/officeDocument/2006/math" xmlns:v="urn:schemas-microsoft-com:vml" xmlns:wp14="http://schemas.microsoft.com/office/word/2010/wordprocessingDrawing" xmlns:wp="http://schemas.openxmlformats.org/drawingml/2006/wordprocessingDrawing" xmlns:w10="urn:schemas-microsoft-com:office:word" xmlns:w="http://schemas.openxmlformats.org/wordprocessingml/2006/main" xmlns:w14="http://schemas.microsoft.com/office/word/2010/wordml" xmlns:w15="http://schemas.microsoft.com/office/word/2012/wordml" xmlns:w16cex="http://schemas.microsoft.com/office/word/2018/wordml/cex" xmlns:w16cid="http://schemas.microsoft.com/office/word/2016/wordml/cid" xmlns:w16="http://schemas.microsoft.com/office/word/2018/wordml" xmlns:w16sdtdh="http://schemas.microsoft.com/office/word/2020/wordml/sdtdatahash" xmlns:w16se="http://schemas.microsoft.com/office/word/2015/wordml/symex" xmlns:wpg="http://schemas.microsoft.com/office/word/2010/wordprocessingGroup" xmlns:wpi="http://schemas.microsoft.com/office/word/2010/wordprocessingInk" xmlns:wne="http://schemas.microsoft.com/office/word/2006/wordml" xmlns:wps="http://schemas.microsoft.com/office/word/2010/wordprocessingShape" mc:Ignorable="w14 w15 w16se w16cid w16 w16cex w16sdtdh wp14">
+<w:document xmlns:wpc="http://schemas.microsoft.com/office/word/2010/wordprocessingCanvas" xmlns:cx="http://schemas.microsoft.com/office/drawing/2014/chartex" xmlns:cx1="http://schemas.microsoft.com/office/drawing/2015/9/8/chartex" xmlns:cx2="http://schemas.microsoft.com/office/drawing/2015/10/21/chartex" xmlns:cx3="http://schemas.microsoft.com/office/drawing/2016/5/9/chartex" xmlns:cx4="http://schemas.microsoft.com/office/drawing/2016/5/10/chartex" xmlns:cx5="http://schemas.microsoft.com/office/drawing/2016/5/11/chartex" xmlns:cx6="http://schemas.microsoft.com/office/drawing/2016/5/12/chartex" xmlns:cx7="http://schemas.microsoft.com/office/drawing/2016/5/13/chartex" xmlns:cx8="http://schemas.microsoft.com/office/drawing/2016/5/14/chartex" xmlns:mc="http://schemas.openxmlformats.org/markup-compatibility/2006" xmlns:aink="http://schemas.microsoft.com/office/drawing/2016/ink" xmlns:am3d="http://schemas.microsoft.com/office/drawing/2017/model3d" xmlns:o="urn:schemas-microsoft-com:office:office" xmlns:oel="http://schemas.microsoft.com/office/2019/extlst" xmlns:r="http://schemas.openxmlformats.org/officeDocument/2006/relationships" xmlns:m="http://schemas.openxmlformats.org/officeDocument/2006/math" xmlns:v="urn:schemas-microsoft-com:vml" xmlns:wp14="http://schemas.microsoft.com/office/word/2010/wordprocessingDrawing" xmlns:wp="http://schemas.openxmlformats.org/drawingml/2006/wordprocessingDrawing" xmlns:w10="urn:schemas-microsoft-com:office:word" xmlns:w="http://schemas.openxmlformats.org/wordprocessingml/2006/main" xmlns:w14="http://schemas.microsoft.com/office/word/2010/wordml" xmlns:w15="http://schemas.microsoft.com/office/word/2012/wordml" xmlns:w16cei="http://schemas.microsoft.com/office/word/2026/wordml/cei" xmlns:w16cex="http://schemas.microsoft.com/office/word/2018/wordml/cex" xmlns:w16cid="http://schemas.microsoft.com/office/word/2016/wordml/cid" xmlns:w16="http://schemas.microsoft.com/office/word/2018/wordml" xmlns:w16du="http://schemas.microsoft.com/office/word/2023/wordml/word16du" xmlns:w16sdtdh="http://schemas.microsoft.com/office/word/2020/wordml/sdtdatahash" xmlns:w16sdtfl="http://schemas.microsoft.com/office/word/2024/wordml/sdtformatlock" xmlns:w16se="http://schemas.microsoft.com/office/word/2015/wordml/symex" xmlns:wpg="http://schemas.microsoft.com/office/word/2010/wordprocessingGroup" xmlns:wpi="http://schemas.microsoft.com/office/word/2010/wordprocessingInk" xmlns:wne="http://schemas.microsoft.com/office/word/2006/wordml" xmlns:wps="http://schemas.microsoft.com/office/word/2010/wordprocessingShape" mc:Ignorable="w14 w15 w16se w16cid w16 w16cex w16sdtdh w16sdtfl w16du wp14">
   <w:body>
     <w:p>
       <w:pPr>
@@ -537,7 +537,6 @@
           <w:iCs/>
           <w:sz w:val="28"/>
           <w:szCs w:val="28"/>
-          <w:u w:val="single"/>
         </w:rPr>
         <w:t>.</w:t>
       </w:r>
@@ -551,7 +550,6 @@
           <w:iCs/>
           <w:sz w:val="28"/>
           <w:szCs w:val="28"/>
-          <w:u w:val="single"/>
         </w:rPr>
         <w:t>spec</w:t>
       </w:r>
@@ -565,7 +563,6 @@
           <w:iCs/>
           <w:sz w:val="28"/>
           <w:szCs w:val="28"/>
-          <w:u w:val="single"/>
         </w:rPr>
         <w:t>.template</w:t>
       </w:r>
@@ -1697,6 +1694,10 @@
       <w:r>
         <w:rPr>
           <w:rFonts w:asciiTheme="majorBidi" w:hAnsiTheme="majorBidi" w:cstheme="majorBidi"/>
+          <w:b/>
+          <w:bCs/>
+          <w:i/>
+          <w:iCs/>
           <w:sz w:val="28"/>
           <w:szCs w:val="28"/>
         </w:rPr>
@@ -1746,7 +1747,27 @@
           <w:sz w:val="28"/>
           <w:szCs w:val="28"/>
         </w:rPr>
-        <w:t>When the restart policy is Never, Kubernetes takes a different approach. If the container inside the Pod fails, the Pod is marked as Failed and is not restarted. Instead, the Job controller creates a new Pod to retry the task. This means each retry attempt runs in a completely new Pod while the previous failed Pods remain in the cluster with a Failed status.</w:t>
+        <w:t xml:space="preserve">When the restart policy is </w:t>
+      </w:r>
+      <w:r>
+        <w:rPr>
+          <w:rFonts w:asciiTheme="majorBidi" w:hAnsiTheme="majorBidi" w:cstheme="majorBidi"/>
+          <w:b/>
+          <w:bCs/>
+          <w:i/>
+          <w:iCs/>
+          <w:sz w:val="28"/>
+          <w:szCs w:val="28"/>
+        </w:rPr>
+        <w:t>Never</w:t>
+      </w:r>
+      <w:r>
+        <w:rPr>
+          <w:rFonts w:asciiTheme="majorBidi" w:hAnsiTheme="majorBidi" w:cstheme="majorBidi"/>
+          <w:sz w:val="28"/>
+          <w:szCs w:val="28"/>
+        </w:rPr>
+        <w:t>, Kubernetes takes a different approach. If the container inside the Pod fails, the Pod is marked as Failed and is not restarted. Instead, the Job controller creates a new Pod to retry the task. This means each retry attempt runs in a completely new Pod while the previous failed Pods remain in the cluster with a Failed status.</w:t>
       </w:r>
     </w:p>
     <w:p>
@@ -3455,8 +3476,6 @@
         <w:jc w:val="both"/>
         <w:rPr>
           <w:rFonts w:asciiTheme="majorBidi" w:hAnsiTheme="majorBidi" w:cstheme="majorBidi"/>
-          <w:sz w:val="20"/>
-          <w:szCs w:val="20"/>
         </w:rPr>
       </w:pPr>
     </w:p>
@@ -3466,17 +3485,19 @@
         <w:jc w:val="both"/>
         <w:rPr>
           <w:rFonts w:asciiTheme="majorBidi" w:hAnsiTheme="majorBidi" w:cstheme="majorBidi"/>
-          <w:sz w:val="28"/>
-          <w:szCs w:val="28"/>
-          <w:u w:val="single"/>
-        </w:rPr>
-      </w:pPr>
-      <w:r>
-        <w:rPr>
-          <w:rFonts w:asciiTheme="majorBidi" w:hAnsiTheme="majorBidi" w:cstheme="majorBidi"/>
-          <w:sz w:val="28"/>
-          <w:szCs w:val="28"/>
-          <w:u w:val="single"/>
+          <w:b/>
+          <w:bCs/>
+          <w:sz w:val="28"/>
+          <w:szCs w:val="28"/>
+        </w:rPr>
+      </w:pPr>
+      <w:r>
+        <w:rPr>
+          <w:rFonts w:asciiTheme="majorBidi" w:hAnsiTheme="majorBidi" w:cstheme="majorBidi"/>
+          <w:b/>
+          <w:bCs/>
+          <w:sz w:val="28"/>
+          <w:szCs w:val="28"/>
         </w:rPr>
         <w:t>Explanation:</w:t>
       </w:r>
@@ -3610,12 +3631,96 @@
           <w:sz w:val="28"/>
           <w:szCs w:val="28"/>
         </w:rPr>
-        <w:t>In a Kubernetes Job, the completions and parallelism fields control how many Pods run and how many successful executions are required before the Job is considered finished. The completions field specifies the total number of successful Pod runs that must occur. For example, if completions: 5, Kubernetes will keep creating and running Pods until five Pods finish successfully, regardless of how many failed attempts happen along the way. Failed Pods do not count toward the completion total; Kubernetes retries by creating new Pods until the required number of successful completions is reached or until the retry limit (</w:t>
+        <w:t xml:space="preserve">In a Kubernetes Job, the </w:t>
+      </w:r>
+      <w:r>
+        <w:rPr>
+          <w:rFonts w:asciiTheme="majorBidi" w:hAnsiTheme="majorBidi" w:cstheme="majorBidi"/>
+          <w:b/>
+          <w:bCs/>
+          <w:i/>
+          <w:iCs/>
+          <w:sz w:val="28"/>
+          <w:szCs w:val="28"/>
+        </w:rPr>
+        <w:t>completions</w:t>
+      </w:r>
+      <w:r>
+        <w:rPr>
+          <w:rFonts w:asciiTheme="majorBidi" w:hAnsiTheme="majorBidi" w:cstheme="majorBidi"/>
+          <w:sz w:val="28"/>
+          <w:szCs w:val="28"/>
+        </w:rPr>
+        <w:t xml:space="preserve"> and </w:t>
+      </w:r>
+      <w:r>
+        <w:rPr>
+          <w:rFonts w:asciiTheme="majorBidi" w:hAnsiTheme="majorBidi" w:cstheme="majorBidi"/>
+          <w:b/>
+          <w:bCs/>
+          <w:i/>
+          <w:iCs/>
+          <w:sz w:val="28"/>
+          <w:szCs w:val="28"/>
+        </w:rPr>
+        <w:t>parallelism</w:t>
+      </w:r>
+      <w:r>
+        <w:rPr>
+          <w:rFonts w:asciiTheme="majorBidi" w:hAnsiTheme="majorBidi" w:cstheme="majorBidi"/>
+          <w:sz w:val="28"/>
+          <w:szCs w:val="28"/>
+        </w:rPr>
+        <w:t xml:space="preserve"> fields control how many Pods run and how many successful executions are required before the Job is considered finished. The </w:t>
+      </w:r>
+      <w:r>
+        <w:rPr>
+          <w:rFonts w:asciiTheme="majorBidi" w:hAnsiTheme="majorBidi" w:cstheme="majorBidi"/>
+          <w:b/>
+          <w:bCs/>
+          <w:i/>
+          <w:iCs/>
+          <w:sz w:val="28"/>
+          <w:szCs w:val="28"/>
+        </w:rPr>
+        <w:t>completions</w:t>
+      </w:r>
+      <w:r>
+        <w:rPr>
+          <w:rFonts w:asciiTheme="majorBidi" w:hAnsiTheme="majorBidi" w:cstheme="majorBidi"/>
+          <w:sz w:val="28"/>
+          <w:szCs w:val="28"/>
+        </w:rPr>
+        <w:t xml:space="preserve"> field specifies the total number of successful Pod runs that must occur. For example, if </w:t>
+      </w:r>
+      <w:r>
+        <w:rPr>
+          <w:rFonts w:asciiTheme="majorBidi" w:hAnsiTheme="majorBidi" w:cstheme="majorBidi"/>
+          <w:b/>
+          <w:bCs/>
+          <w:i/>
+          <w:iCs/>
+          <w:sz w:val="28"/>
+          <w:szCs w:val="28"/>
+        </w:rPr>
+        <w:t>completions: 5</w:t>
+      </w:r>
+      <w:r>
+        <w:rPr>
+          <w:rFonts w:asciiTheme="majorBidi" w:hAnsiTheme="majorBidi" w:cstheme="majorBidi"/>
+          <w:sz w:val="28"/>
+          <w:szCs w:val="28"/>
+        </w:rPr>
+        <w:t>, Kubernetes will keep creating and running Pods until five Pods finish successfully, regardless of how many failed attempts happen along the way. Failed Pods do not count toward the completion total; Kubernetes retries by creating new Pods until the required number of successful completions is reached or until the retry limit (</w:t>
       </w:r>
       <w:proofErr w:type="spellStart"/>
       <w:r>
         <w:rPr>
           <w:rFonts w:asciiTheme="majorBidi" w:hAnsiTheme="majorBidi" w:cstheme="majorBidi"/>
+          <w:b/>
+          <w:bCs/>
+          <w:i/>
+          <w:iCs/>
           <w:sz w:val="28"/>
           <w:szCs w:val="28"/>
         </w:rPr>
@@ -3647,12 +3752,72 @@
           <w:sz w:val="28"/>
           <w:szCs w:val="28"/>
         </w:rPr>
-        <w:t xml:space="preserve">The parallelism field controls how many Pods can run at the same time. For example, if parallelism: 3 and completions: 5, Kubernetes will run up to three Pods concurrently. As Pods finish successfully, Kubernetes starts new Pods (if needed) to continue progressing toward the total completion goal of five successful runs. If some Pods fail, Kubernetes may create replacement Pods—subject to the </w:t>
+        <w:t xml:space="preserve">The parallelism field controls how many Pods can run at the same time. For example, if </w:t>
+      </w:r>
+      <w:r>
+        <w:rPr>
+          <w:rFonts w:asciiTheme="majorBidi" w:hAnsiTheme="majorBidi" w:cstheme="majorBidi"/>
+          <w:b/>
+          <w:bCs/>
+          <w:i/>
+          <w:iCs/>
+          <w:sz w:val="28"/>
+          <w:szCs w:val="28"/>
+        </w:rPr>
+        <w:t>parallelism: 3</w:t>
+      </w:r>
+      <w:r>
+        <w:rPr>
+          <w:rFonts w:asciiTheme="majorBidi" w:hAnsiTheme="majorBidi" w:cstheme="majorBidi"/>
+          <w:sz w:val="28"/>
+          <w:szCs w:val="28"/>
+        </w:rPr>
+        <w:t xml:space="preserve"> and </w:t>
+      </w:r>
+      <w:r>
+        <w:rPr>
+          <w:rFonts w:asciiTheme="majorBidi" w:hAnsiTheme="majorBidi" w:cstheme="majorBidi"/>
+          <w:b/>
+          <w:bCs/>
+          <w:i/>
+          <w:iCs/>
+          <w:sz w:val="28"/>
+          <w:szCs w:val="28"/>
+        </w:rPr>
+        <w:t>completions: 5</w:t>
+      </w:r>
+      <w:r>
+        <w:rPr>
+          <w:rFonts w:asciiTheme="majorBidi" w:hAnsiTheme="majorBidi" w:cstheme="majorBidi"/>
+          <w:sz w:val="28"/>
+          <w:szCs w:val="28"/>
+        </w:rPr>
+        <w:t>, Kubernetes will run up to three Pods concurrently. As Pods finish successfully, Kubernetes starts new Pods (if needed) to continue progressing toward the total completion goal of five successful runs. If some Pods fail, Kubernetes may create replacement Pods</w:t>
+      </w:r>
+      <w:r>
+        <w:rPr>
+          <w:rFonts w:asciiTheme="majorBidi" w:hAnsiTheme="majorBidi" w:cstheme="majorBidi"/>
+          <w:sz w:val="28"/>
+          <w:szCs w:val="28"/>
+        </w:rPr>
+        <w:t xml:space="preserve">, </w:t>
+      </w:r>
+      <w:r>
+        <w:rPr>
+          <w:rFonts w:asciiTheme="majorBidi" w:hAnsiTheme="majorBidi" w:cstheme="majorBidi"/>
+          <w:sz w:val="28"/>
+          <w:szCs w:val="28"/>
+        </w:rPr>
+        <w:t xml:space="preserve">subject to the </w:t>
       </w:r>
       <w:proofErr w:type="spellStart"/>
       <w:r>
         <w:rPr>
           <w:rFonts w:asciiTheme="majorBidi" w:hAnsiTheme="majorBidi" w:cstheme="majorBidi"/>
+          <w:b/>
+          <w:bCs/>
+          <w:i/>
+          <w:iCs/>
           <w:sz w:val="28"/>
           <w:szCs w:val="28"/>
         </w:rPr>
@@ -3683,7 +3848,27 @@
           <w:sz w:val="28"/>
           <w:szCs w:val="28"/>
         </w:rPr>
-        <w:t xml:space="preserve">In other words, completions </w:t>
+        <w:t xml:space="preserve">In other words, </w:t>
+      </w:r>
+      <w:r>
+        <w:rPr>
+          <w:rFonts w:asciiTheme="majorBidi" w:hAnsiTheme="majorBidi" w:cstheme="majorBidi"/>
+          <w:b/>
+          <w:bCs/>
+          <w:i/>
+          <w:iCs/>
+          <w:sz w:val="28"/>
+          <w:szCs w:val="28"/>
+        </w:rPr>
+        <w:t>completions</w:t>
+      </w:r>
+      <w:r>
+        <w:rPr>
+          <w:rFonts w:asciiTheme="majorBidi" w:hAnsiTheme="majorBidi" w:cstheme="majorBidi"/>
+          <w:sz w:val="28"/>
+          <w:szCs w:val="28"/>
+        </w:rPr>
+        <w:t xml:space="preserve"> </w:t>
       </w:r>
       <w:proofErr w:type="gramStart"/>
       <w:r>
@@ -3701,7 +3886,47 @@
           <w:sz w:val="28"/>
           <w:szCs w:val="28"/>
         </w:rPr>
-        <w:t xml:space="preserve"> how many successful results are required, while parallelism defines how much concurrency is allowed while achieving those results. If parallelism is not specified, Kubernetes defaults it to 1, meaning the Pods run sequentially. This mechanism allows Jobs to efficiently process tasks such as batch data processing, large computations, or distributed workloads by running multiple Pods simultaneously while still ensuring that the required number of successful executions is achieved.</w:t>
+        <w:t xml:space="preserve"> how many successful results are required, while </w:t>
+      </w:r>
+      <w:r>
+        <w:rPr>
+          <w:rFonts w:asciiTheme="majorBidi" w:hAnsiTheme="majorBidi" w:cstheme="majorBidi"/>
+          <w:b/>
+          <w:bCs/>
+          <w:i/>
+          <w:iCs/>
+          <w:sz w:val="28"/>
+          <w:szCs w:val="28"/>
+        </w:rPr>
+        <w:t>parallelism</w:t>
+      </w:r>
+      <w:r>
+        <w:rPr>
+          <w:rFonts w:asciiTheme="majorBidi" w:hAnsiTheme="majorBidi" w:cstheme="majorBidi"/>
+          <w:sz w:val="28"/>
+          <w:szCs w:val="28"/>
+        </w:rPr>
+        <w:t xml:space="preserve"> defines how much concurrency is allowed while achieving those results. If </w:t>
+      </w:r>
+      <w:r>
+        <w:rPr>
+          <w:rFonts w:asciiTheme="majorBidi" w:hAnsiTheme="majorBidi" w:cstheme="majorBidi"/>
+          <w:b/>
+          <w:bCs/>
+          <w:i/>
+          <w:iCs/>
+          <w:sz w:val="28"/>
+          <w:szCs w:val="28"/>
+        </w:rPr>
+        <w:t>parallelism</w:t>
+      </w:r>
+      <w:r>
+        <w:rPr>
+          <w:rFonts w:asciiTheme="majorBidi" w:hAnsiTheme="majorBidi" w:cstheme="majorBidi"/>
+          <w:sz w:val="28"/>
+          <w:szCs w:val="28"/>
+        </w:rPr>
+        <w:t xml:space="preserve"> is not specified, Kubernetes defaults it to 1, meaning the Pods run sequentially. This mechanism allows Jobs to efficiently process tasks such as batch data processing, large computations, or distributed workloads by running multiple Pods simultaneously while still ensuring that the required number of successful executions is achieved.</w:t>
       </w:r>
     </w:p>
     <w:p>
@@ -10827,7 +11052,7 @@
           <w:sz w:val="32"/>
           <w:szCs w:val="32"/>
         </w:rPr>
-        <w:t>Example Cron</w:t>
+        <w:t xml:space="preserve">Example </w:t>
       </w:r>
       <w:proofErr w:type="spellStart"/>
       <w:r>
@@ -10838,7 +11063,7 @@
           <w:sz w:val="32"/>
           <w:szCs w:val="32"/>
         </w:rPr>
-        <w:t>Job</w:t>
+        <w:t>CronJob</w:t>
       </w:r>
       <w:proofErr w:type="spellEnd"/>
     </w:p>
@@ -11086,7 +11311,7 @@
 </file>
 
 <file path=word/numbering.xml><?xml version="1.0" encoding="utf-8"?>
-<w:numbering xmlns:wpc="http://schemas.microsoft.com/office/word/2010/wordprocessingCanvas" xmlns:cx="http://schemas.microsoft.com/office/drawing/2014/chartex" xmlns:cx1="http://schemas.microsoft.com/office/drawing/2015/9/8/chartex" xmlns:cx2="http://schemas.microsoft.com/office/drawing/2015/10/21/chartex" xmlns:cx3="http://schemas.microsoft.com/office/drawing/2016/5/9/chartex" xmlns:cx4="http://schemas.microsoft.com/office/drawing/2016/5/10/chartex" xmlns:cx5="http://schemas.microsoft.com/office/drawing/2016/5/11/chartex" xmlns:cx6="http://schemas.microsoft.com/office/drawing/2016/5/12/chartex" xmlns:cx7="http://schemas.microsoft.com/office/drawing/2016/5/13/chartex" xmlns:cx8="http://schemas.microsoft.com/office/drawing/2016/5/14/chartex" xmlns:mc="http://schemas.openxmlformats.org/markup-compatibility/2006" xmlns:aink="http://schemas.microsoft.com/office/drawing/2016/ink" xmlns:am3d="http://schemas.microsoft.com/office/drawing/2017/model3d" xmlns:o="urn:schemas-microsoft-com:office:office" xmlns:oel="http://schemas.microsoft.com/office/2019/extlst" xmlns:r="http://schemas.openxmlformats.org/officeDocument/2006/relationships" xmlns:m="http://schemas.openxmlformats.org/officeDocument/2006/math" xmlns:v="urn:schemas-microsoft-com:vml" xmlns:wp14="http://schemas.microsoft.com/office/word/2010/wordprocessingDrawing" xmlns:wp="http://schemas.openxmlformats.org/drawingml/2006/wordprocessingDrawing" xmlns:w10="urn:schemas-microsoft-com:office:word" xmlns:w="http://schemas.openxmlformats.org/wordprocessingml/2006/main" xmlns:w14="http://schemas.microsoft.com/office/word/2010/wordml" xmlns:w15="http://schemas.microsoft.com/office/word/2012/wordml" xmlns:w16cex="http://schemas.microsoft.com/office/word/2018/wordml/cex" xmlns:w16cid="http://schemas.microsoft.com/office/word/2016/wordml/cid" xmlns:w16="http://schemas.microsoft.com/office/word/2018/wordml" xmlns:w16sdtdh="http://schemas.microsoft.com/office/word/2020/wordml/sdtdatahash" xmlns:w16se="http://schemas.microsoft.com/office/word/2015/wordml/symex" xmlns:wpg="http://schemas.microsoft.com/office/word/2010/wordprocessingGroup" xmlns:wpi="http://schemas.microsoft.com/office/word/2010/wordprocessingInk" xmlns:wne="http://schemas.microsoft.com/office/word/2006/wordml" xmlns:wps="http://schemas.microsoft.com/office/word/2010/wordprocessingShape" mc:Ignorable="w14 w15 w16se w16cid w16 w16cex w16sdtdh wp14">
+<w:numbering xmlns:wpc="http://schemas.microsoft.com/office/word/2010/wordprocessingCanvas" xmlns:cx="http://schemas.microsoft.com/office/drawing/2014/chartex" xmlns:cx1="http://schemas.microsoft.com/office/drawing/2015/9/8/chartex" xmlns:cx2="http://schemas.microsoft.com/office/drawing/2015/10/21/chartex" xmlns:cx3="http://schemas.microsoft.com/office/drawing/2016/5/9/chartex" xmlns:cx4="http://schemas.microsoft.com/office/drawing/2016/5/10/chartex" xmlns:cx5="http://schemas.microsoft.com/office/drawing/2016/5/11/chartex" xmlns:cx6="http://schemas.microsoft.com/office/drawing/2016/5/12/chartex" xmlns:cx7="http://schemas.microsoft.com/office/drawing/2016/5/13/chartex" xmlns:cx8="http://schemas.microsoft.com/office/drawing/2016/5/14/chartex" xmlns:mc="http://schemas.openxmlformats.org/markup-compatibility/2006" xmlns:aink="http://schemas.microsoft.com/office/drawing/2016/ink" xmlns:am3d="http://schemas.microsoft.com/office/drawing/2017/model3d" xmlns:o="urn:schemas-microsoft-com:office:office" xmlns:oel="http://schemas.microsoft.com/office/2019/extlst" xmlns:r="http://schemas.openxmlformats.org/officeDocument/2006/relationships" xmlns:m="http://schemas.openxmlformats.org/officeDocument/2006/math" xmlns:v="urn:schemas-microsoft-com:vml" xmlns:wp14="http://schemas.microsoft.com/office/word/2010/wordprocessingDrawing" xmlns:wp="http://schemas.openxmlformats.org/drawingml/2006/wordprocessingDrawing" xmlns:w10="urn:schemas-microsoft-com:office:word" xmlns:w="http://schemas.openxmlformats.org/wordprocessingml/2006/main" xmlns:w14="http://schemas.microsoft.com/office/word/2010/wordml" xmlns:w15="http://schemas.microsoft.com/office/word/2012/wordml" xmlns:w16cei="http://schemas.microsoft.com/office/word/2026/wordml/cei" xmlns:w16cex="http://schemas.microsoft.com/office/word/2018/wordml/cex" xmlns:w16cid="http://schemas.microsoft.com/office/word/2016/wordml/cid" xmlns:w16="http://schemas.microsoft.com/office/word/2018/wordml" xmlns:w16du="http://schemas.microsoft.com/office/word/2023/wordml/word16du" xmlns:w16sdtdh="http://schemas.microsoft.com/office/word/2020/wordml/sdtdatahash" xmlns:w16sdtfl="http://schemas.microsoft.com/office/word/2024/wordml/sdtformatlock" xmlns:w16se="http://schemas.microsoft.com/office/word/2015/wordml/symex" xmlns:wpg="http://schemas.microsoft.com/office/word/2010/wordprocessingGroup" xmlns:wpi="http://schemas.microsoft.com/office/word/2010/wordprocessingInk" xmlns:wne="http://schemas.microsoft.com/office/word/2006/wordml" xmlns:wps="http://schemas.microsoft.com/office/word/2010/wordprocessingShape" mc:Ignorable="w14 w15 w16se w16cid w16 w16cex w16sdtdh w16sdtfl w16du wp14">
   <w:abstractNum w:abstractNumId="0" w15:restartNumberingAfterBreak="0">
     <w:nsid w:val="04C82636"/>
     <w:multiLevelType w:val="hybridMultilevel"/>
@@ -14196,7 +14421,7 @@
 </file>
 
 <file path=word/styles.xml><?xml version="1.0" encoding="utf-8"?>
-<w:styles xmlns:mc="http://schemas.openxmlformats.org/markup-compatibility/2006" xmlns:r="http://schemas.openxmlformats.org/officeDocument/2006/relationships" xmlns:w="http://schemas.openxmlformats.org/wordprocessingml/2006/main" xmlns:w14="http://schemas.microsoft.com/office/word/2010/wordml" xmlns:w15="http://schemas.microsoft.com/office/word/2012/wordml" xmlns:w16cex="http://schemas.microsoft.com/office/word/2018/wordml/cex" xmlns:w16cid="http://schemas.microsoft.com/office/word/2016/wordml/cid" xmlns:w16="http://schemas.microsoft.com/office/word/2018/wordml" xmlns:w16sdtdh="http://schemas.microsoft.com/office/word/2020/wordml/sdtdatahash" xmlns:w16se="http://schemas.microsoft.com/office/word/2015/wordml/symex" mc:Ignorable="w14 w15 w16se w16cid w16 w16cex w16sdtdh">
+<w:styles xmlns:mc="http://schemas.openxmlformats.org/markup-compatibility/2006" xmlns:r="http://schemas.openxmlformats.org/officeDocument/2006/relationships" xmlns:w="http://schemas.openxmlformats.org/wordprocessingml/2006/main" xmlns:w14="http://schemas.microsoft.com/office/word/2010/wordml" xmlns:w15="http://schemas.microsoft.com/office/word/2012/wordml" xmlns:w16cex="http://schemas.microsoft.com/office/word/2018/wordml/cex" xmlns:w16cid="http://schemas.microsoft.com/office/word/2016/wordml/cid" xmlns:w16="http://schemas.microsoft.com/office/word/2018/wordml" xmlns:w16du="http://schemas.microsoft.com/office/word/2023/wordml/word16du" xmlns:w16sdtdh="http://schemas.microsoft.com/office/word/2020/wordml/sdtdatahash" xmlns:w16sdtfl="http://schemas.microsoft.com/office/word/2024/wordml/sdtformatlock" xmlns:w16se="http://schemas.microsoft.com/office/word/2015/wordml/symex" mc:Ignorable="w14 w15 w16se w16cid w16 w16cex w16sdtdh w16sdtfl w16du">
   <w:docDefaults>
     <w:rPrDefault>
       <w:rPr>

</xml_diff>